<commit_message>
feat: implement modular FWD data conversion pipeline with PyQt6 GUI and standardized data model
</commit_message>
<xml_diff>
--- a/samples/01_LHS.docx
+++ b/samples/01_LHS.docx
@@ -16,15 +16,17 @@
         <w:tblLook w:firstColumn="1" w:firstRow="1" w:lastColumn="0" w:lastRow="0" w:noHBand="0" w:noVBand="1" w:val="04A0"/>
       </w:tblPr>
       <w:tblGrid>
-        <w:gridCol w:w="2160"/>
-        <w:gridCol w:w="2160"/>
-        <w:gridCol w:w="2160"/>
-        <w:gridCol w:w="2160"/>
+        <w:gridCol w:w="1440"/>
+        <w:gridCol w:w="1440"/>
+        <w:gridCol w:w="1440"/>
+        <w:gridCol w:w="1440"/>
+        <w:gridCol w:w="1440"/>
+        <w:gridCol w:w="1440"/>
       </w:tblGrid>
       <w:tr>
         <w:tc>
           <w:tcPr>
-            <w:tcW w:type="dxa" w:w="2160"/>
+            <w:tcW w:type="dxa" w:w="1440"/>
           </w:tcPr>
           <w:p>
             <w:r>
@@ -34,7 +36,7 @@
         </w:tc>
         <w:tc>
           <w:tcPr>
-            <w:tcW w:type="dxa" w:w="2160"/>
+            <w:tcW w:type="dxa" w:w="1440"/>
           </w:tcPr>
           <w:p>
             <w:r>
@@ -44,21 +46,41 @@
         </w:tc>
         <w:tc>
           <w:tcPr>
-            <w:tcW w:type="dxa" w:w="2160"/>
+            <w:tcW w:type="dxa" w:w="1440"/>
           </w:tcPr>
           <w:p>
             <w:r>
-              <w:t>D0 (mm)</w:t>
+              <w:t>Force</w:t>
             </w:r>
           </w:p>
         </w:tc>
         <w:tc>
           <w:tcPr>
-            <w:tcW w:type="dxa" w:w="2160"/>
+            <w:tcW w:type="dxa" w:w="1440"/>
           </w:tcPr>
           <w:p>
             <w:r>
-              <w:t>D300 (mm)</w:t>
+              <w:t>D0</w:t>
+            </w:r>
+          </w:p>
+        </w:tc>
+        <w:tc>
+          <w:tcPr>
+            <w:tcW w:type="dxa" w:w="1440"/>
+          </w:tcPr>
+          <w:p>
+            <w:r>
+              <w:t>D1</w:t>
+            </w:r>
+          </w:p>
+        </w:tc>
+        <w:tc>
+          <w:tcPr>
+            <w:tcW w:type="dxa" w:w="1440"/>
+          </w:tcPr>
+          <w:p>
+            <w:r>
+              <w:t>D2</w:t>
             </w:r>
           </w:p>
         </w:tc>
@@ -66,49 +88,7 @@
       <w:tr>
         <w:tc>
           <w:tcPr>
-            <w:tcW w:type="dxa" w:w="2160"/>
-          </w:tcPr>
-          <w:p>
-            <w:r>
-              <w:t>A10</w:t>
-            </w:r>
-          </w:p>
-        </w:tc>
-        <w:tc>
-          <w:tcPr>
-            <w:tcW w:type="dxa" w:w="2160"/>
-          </w:tcPr>
-          <w:p>
-            <w:r>
-              <w:t>50</w:t>
-            </w:r>
-          </w:p>
-        </w:tc>
-        <w:tc>
-          <w:tcPr>
-            <w:tcW w:type="dxa" w:w="2160"/>
-          </w:tcPr>
-          <w:p>
-            <w:r>
-              <w:t>0.40</w:t>
-            </w:r>
-          </w:p>
-        </w:tc>
-        <w:tc>
-          <w:tcPr>
-            <w:tcW w:type="dxa" w:w="2160"/>
-          </w:tcPr>
-          <w:p>
-            <w:r>
-              <w:t>0.25</w:t>
-            </w:r>
-          </w:p>
-        </w:tc>
-      </w:tr>
-      <w:tr>
-        <w:tc>
-          <w:tcPr>
-            <w:tcW w:type="dxa" w:w="2160"/>
+            <w:tcW w:type="dxa" w:w="1440"/>
           </w:tcPr>
           <w:p>
             <w:r>
@@ -118,7 +98,7 @@
         </w:tc>
         <w:tc>
           <w:tcPr>
-            <w:tcW w:type="dxa" w:w="2160"/>
+            <w:tcW w:type="dxa" w:w="1440"/>
           </w:tcPr>
           <w:p>
             <w:r>
@@ -128,7 +108,17 @@
         </w:tc>
         <w:tc>
           <w:tcPr>
-            <w:tcW w:type="dxa" w:w="2160"/>
+            <w:tcW w:type="dxa" w:w="1440"/>
+          </w:tcPr>
+          <w:p>
+            <w:r>
+              <w:t>40.2</w:t>
+            </w:r>
+          </w:p>
+        </w:tc>
+        <w:tc>
+          <w:tcPr>
+            <w:tcW w:type="dxa" w:w="1440"/>
           </w:tcPr>
           <w:p>
             <w:r>
@@ -138,7 +128,7 @@
         </w:tc>
         <w:tc>
           <w:tcPr>
-            <w:tcW w:type="dxa" w:w="2160"/>
+            <w:tcW w:type="dxa" w:w="1440"/>
           </w:tcPr>
           <w:p>
             <w:r>
@@ -146,45 +136,13 @@
             </w:r>
           </w:p>
         </w:tc>
-      </w:tr>
-      <w:tr>
         <w:tc>
           <w:tcPr>
-            <w:tcW w:type="dxa" w:w="2160"/>
+            <w:tcW w:type="dxa" w:w="1440"/>
           </w:tcPr>
           <w:p>
             <w:r>
-              <w:t>B20</w:t>
-            </w:r>
-          </w:p>
-        </w:tc>
-        <w:tc>
-          <w:tcPr>
-            <w:tcW w:type="dxa" w:w="2160"/>
-          </w:tcPr>
-          <w:p>
-            <w:r>
-              <w:t>102</w:t>
-            </w:r>
-          </w:p>
-        </w:tc>
-        <w:tc>
-          <w:tcPr>
-            <w:tcW w:type="dxa" w:w="2160"/>
-          </w:tcPr>
-          <w:p>
-            <w:r>
-              <w:t>0.48</w:t>
-            </w:r>
-          </w:p>
-        </w:tc>
-        <w:tc>
-          <w:tcPr>
-            <w:tcW w:type="dxa" w:w="2160"/>
-          </w:tcPr>
-          <w:p>
-            <w:r>
-              <w:t>0.30</w:t>
+              <w:t>0.33</w:t>
             </w:r>
           </w:p>
         </w:tc>
@@ -192,7 +150,7 @@
       <w:tr>
         <w:tc>
           <w:tcPr>
-            <w:tcW w:type="dxa" w:w="2160"/>
+            <w:tcW w:type="dxa" w:w="1440"/>
           </w:tcPr>
           <w:p>
             <w:r>
@@ -202,7 +160,7 @@
         </w:tc>
         <w:tc>
           <w:tcPr>
-            <w:tcW w:type="dxa" w:w="2160"/>
+            <w:tcW w:type="dxa" w:w="1440"/>
           </w:tcPr>
           <w:p>
             <w:r>
@@ -212,7 +170,17 @@
         </w:tc>
         <w:tc>
           <w:tcPr>
-            <w:tcW w:type="dxa" w:w="2160"/>
+            <w:tcW w:type="dxa" w:w="1440"/>
+          </w:tcPr>
+          <w:p>
+            <w:r>
+              <w:t>39.8</w:t>
+            </w:r>
+          </w:p>
+        </w:tc>
+        <w:tc>
+          <w:tcPr>
+            <w:tcW w:type="dxa" w:w="1440"/>
           </w:tcPr>
           <w:p>
             <w:r>
@@ -222,11 +190,21 @@
         </w:tc>
         <w:tc>
           <w:tcPr>
-            <w:tcW w:type="dxa" w:w="2160"/>
+            <w:tcW w:type="dxa" w:w="1440"/>
           </w:tcPr>
           <w:p>
             <w:r>
-              <w:t>0.38</w:t>
+              <w:t>0.39</w:t>
+            </w:r>
+          </w:p>
+        </w:tc>
+        <w:tc>
+          <w:tcPr>
+            <w:tcW w:type="dxa" w:w="1440"/>
+          </w:tcPr>
+          <w:p>
+            <w:r>
+              <w:t>0.31</w:t>
             </w:r>
           </w:p>
         </w:tc>

</xml_diff>